<commit_message>
fix: resolve workflow and deployment bugs
</commit_message>
<xml_diff>
--- a/apps/backend/templates/individual-task.docx
+++ b/apps/backend/templates/individual-task.docx
@@ -1,8 +1,8 @@
 
 <file path=word/document.xml><?xml version="1.0" encoding="utf-8"?>
-<w:document xmlns:mc="http://schemas.openxmlformats.org/markup-compatibility/2006" xmlns:o="urn:schemas-microsoft-com:office:office" xmlns:r="http://schemas.openxmlformats.org/officeDocument/2006/relationships" xmlns:m="http://schemas.openxmlformats.org/officeDocument/2006/math" xmlns:v="urn:schemas-microsoft-com:vml" xmlns:wp="http://schemas.openxmlformats.org/drawingml/2006/wordprocessingDrawing" xmlns:w10="urn:schemas-microsoft-com:office:word" xmlns:w="http://schemas.openxmlformats.org/wordprocessingml/2006/main" xmlns:wne="http://schemas.microsoft.com/office/word/2006/wordml" xmlns:sl="http://schemas.openxmlformats.org/schemaLibrary/2006/main" xmlns:a="http://schemas.openxmlformats.org/drawingml/2006/main" xmlns:pic="http://schemas.openxmlformats.org/drawingml/2006/picture" xmlns:c="http://schemas.openxmlformats.org/drawingml/2006/chart" xmlns:lc="http://schemas.openxmlformats.org/drawingml/2006/lockedCanvas" xmlns:dgm="http://schemas.openxmlformats.org/drawingml/2006/diagram" xmlns:wps="http://schemas.microsoft.com/office/word/2010/wordprocessingShape" xmlns:wpg="http://schemas.microsoft.com/office/word/2010/wordprocessingGroup" xmlns:w14="http://schemas.microsoft.com/office/word/2010/wordml" xmlns:w15="http://schemas.microsoft.com/office/word/2012/wordml" xmlns:w16="http://schemas.microsoft.com/office/word/2018/wordml" xmlns:w16cex="http://schemas.microsoft.com/office/word/2018/wordml/cex" xmlns:w16cid="http://schemas.microsoft.com/office/word/2016/wordml/cid" xmlns="http://schemas.microsoft.com/office/tasks/2019/documenttasks" xmlns:cr="http://schemas.microsoft.com/office/comments/2020/reactions">
+<w:document xmlns:ns1="http://schemas.microsoft.com/office/word/2010/wordml" xmlns:w="http://schemas.openxmlformats.org/wordprocessingml/2006/main">
   <w:body>
-    <w:p>
+    <w:p ns1:paraId="00000001">
       <w:pPr>
         <w:jc w:val="center"/>
         <w:rPr>
@@ -25,7 +25,7 @@
         <w:t xml:space="preserve">Министерство науки и высшего образования Российской Федерации</w:t>
       </w:r>
     </w:p>
-    <w:p>
+    <w:p ns1:paraId="00000002">
       <w:pPr>
         <w:jc w:val="center"/>
         <w:rPr>
@@ -48,7 +48,7 @@
         <w:t xml:space="preserve">ФГАОУ ВО «УрФУ имени первого Президента России Б.Н. Ельцина»</w:t>
       </w:r>
     </w:p>
-    <w:p>
+    <w:p ns1:paraId="00000003">
       <w:pPr>
         <w:rPr>
           <w:b w:val="1"/>
@@ -98,7 +98,7 @@
         </w:trPr>
         <w:tc>
           <w:tcPr/>
-          <w:p>
+          <w:p ns1:paraId="00000004">
             <w:pPr>
               <w:rPr>
                 <w:sz w:val="28"/>
@@ -116,7 +116,7 @@
               <w:t xml:space="preserve">СОГЛАСОВАНО               предприятие</w:t>
             </w:r>
           </w:p>
-          <w:p>
+          <w:p ns1:paraId="00000005">
             <w:pPr>
               <w:rPr>
                 <w:sz w:val="28"/>
@@ -180,7 +180,7 @@
         </w:tc>
         <w:tc>
           <w:tcPr/>
-          <w:p>
+          <w:p ns1:paraId="00000006">
             <w:pPr>
               <w:rPr>
                 <w:sz w:val="28"/>
@@ -198,7 +198,7 @@
               <w:t xml:space="preserve">СОГЛАСОВАНО</w:t>
             </w:r>
           </w:p>
-          <w:p>
+          <w:p ns1:paraId="00000007">
             <w:pPr>
               <w:rPr>
                 <w:sz w:val="28"/>
@@ -216,7 +216,7 @@
               <w:t xml:space="preserve"> УрФУ</w:t>
             </w:r>
           </w:p>
-          <w:p>
+          <w:p ns1:paraId="00000008">
             <w:pPr>
               <w:rPr>
                 <w:sz w:val="28"/>
@@ -285,7 +285,7 @@
         </w:trPr>
         <w:tc>
           <w:tcPr/>
-          <w:p>
+          <w:p ns1:paraId="00000009">
             <w:pPr>
               <w:pBdr>
                 <w:top w:space="0" w:sz="0" w:val="nil"/>
@@ -348,7 +348,7 @@
               <w:t xml:space="preserve">____</w:t>
             </w:r>
           </w:p>
-          <w:p>
+          <w:p ns1:paraId="0000000A">
             <w:pPr>
               <w:pBdr>
                 <w:top w:space="0" w:sz="0" w:val="nil"/>
@@ -384,7 +384,7 @@
               <w:t xml:space="preserve">Подпись                                          расшифровка подписи</w:t>
             </w:r>
           </w:p>
-          <w:p>
+          <w:p ns1:paraId="0000000B">
             <w:pPr>
               <w:rPr>
                 <w:sz w:val="20"/>
@@ -401,7 +401,7 @@
         </w:tc>
         <w:tc>
           <w:tcPr/>
-          <w:p>
+          <w:p ns1:paraId="0000000C">
             <w:pPr>
               <w:rPr>
                 <w:b w:val="1"/>
@@ -426,7 +426,7 @@
               </w:rPr>
             </w:r>
           </w:p>
-          <w:p>
+          <w:p ns1:paraId="0000000D">
             <w:pPr>
               <w:pBdr>
                 <w:top w:space="0" w:sz="0" w:val="nil"/>
@@ -466,7 +466,7 @@
               <w:t xml:space="preserve"> </w:t>
             </w:r>
           </w:p>
-          <w:p>
+          <w:p ns1:paraId="0000000E">
             <w:pPr>
               <w:pBdr>
                 <w:top w:space="0" w:sz="0" w:val="nil"/>
@@ -512,7 +512,7 @@
               <w:t xml:space="preserve">Подпись                                                расшифровка подписи</w:t>
             </w:r>
           </w:p>
-          <w:p>
+          <w:p ns1:paraId="0000000F">
             <w:pPr>
               <w:rPr>
                 <w:sz w:val="20"/>
@@ -529,7 +529,7 @@
         </w:tc>
       </w:tr>
     </w:tbl>
-    <w:p>
+    <w:p ns1:paraId="00000010">
       <w:pPr>
         <w:rPr>
           <w:sz w:val="26"/>
@@ -543,7 +543,7 @@
         </w:rPr>
       </w:r>
     </w:p>
-    <w:p>
+    <w:p ns1:paraId="00000011">
       <w:pPr>
         <w:jc w:val="both"/>
         <w:rPr>
@@ -573,6 +573,8 @@
       <w:r>
         <w:rPr>
           <w:rtl w:val="0"/>
+          <w:sz w:val="20"/>
+          <w:szCs w:val="20"/>
         </w:rPr>
         <w:t xml:space="preserve">{{group}}</w:t>
       </w:r>
@@ -597,7 +599,7 @@
         <w:t xml:space="preserve"> </w:t>
       </w:r>
     </w:p>
-    <w:p>
+    <w:p ns1:paraId="00000012">
       <w:pPr>
         <w:jc w:val="both"/>
         <w:rPr/>
@@ -612,11 +614,13 @@
       <w:r>
         <w:rPr>
           <w:rtl w:val="0"/>
+          <w:sz w:val="20"/>
+          <w:szCs w:val="20"/>
         </w:rPr>
         <w:t xml:space="preserve">{{direction_code}} {{direction_name}}</w:t>
       </w:r>
     </w:p>
-    <w:p>
+    <w:p ns1:paraId="00000013">
       <w:pPr>
         <w:rPr/>
       </w:pPr>
@@ -630,11 +634,13 @@
       <w:r>
         <w:rPr>
           <w:rtl w:val="0"/>
+          <w:sz w:val="20"/>
+          <w:szCs w:val="20"/>
         </w:rPr>
         <w:t xml:space="preserve">{{program_name}}</w:t>
       </w:r>
     </w:p>
-    <w:p>
+    <w:p ns1:paraId="00000014">
       <w:pPr>
         <w:jc w:val="center"/>
         <w:rPr>
@@ -657,7 +663,7 @@
         <w:t xml:space="preserve">ИНДИВИДУАЛЬНОЕ ЗАДАНИЕ</w:t>
       </w:r>
     </w:p>
-    <w:p>
+    <w:p ns1:paraId="00000015">
       <w:pPr>
         <w:pBdr>
           <w:bottom w:color="000000" w:space="1" w:sz="12" w:val="single"/>
@@ -675,7 +681,7 @@
         <w:t xml:space="preserve">На учебную, производственную (преддипломную) практику студента</w:t>
       </w:r>
     </w:p>
-    <w:p>
+    <w:p ns1:paraId="00000016">
       <w:pPr>
         <w:pBdr>
           <w:bottom w:color="000000" w:space="1" w:sz="12" w:val="single"/>
@@ -693,15 +699,15 @@
         <w:rPr>
           <w:b w:val="1"/>
           <w:bCs w:val="1"/>
-          <w:sz w:val="28"/>
-          <w:szCs w:val="28"/>
+          <w:sz w:val="20"/>
+          <w:szCs w:val="20"/>
           <w:u w:val="none"/>
           <w:rtl w:val="0"/>
         </w:rPr>
         <w:t xml:space="preserve">{{student_fio}}</w:t>
       </w:r>
     </w:p>
-    <w:p>
+    <w:p ns1:paraId="00000017">
       <w:pPr>
         <w:jc w:val="center"/>
         <w:rPr>
@@ -720,7 +726,7 @@
         <w:t xml:space="preserve">(фамилия, имя, отчество)</w:t>
       </w:r>
     </w:p>
-    <w:p>
+    <w:p ns1:paraId="00000018">
       <w:pPr>
         <w:ind w:right="-277"/>
         <w:jc w:val="both"/>
@@ -738,6 +744,8 @@
       <w:r>
         <w:rPr>
           <w:rtl w:val="0"/>
+          <w:sz w:val="20"/>
+          <w:szCs w:val="20"/>
         </w:rPr>
         <w:t xml:space="preserve">{{practice_topic}}</w:t>
         <w:tab/>
@@ -752,7 +760,7 @@
         </w:rPr>
       </w:r>
     </w:p>
-    <w:p>
+    <w:p ns1:paraId="00000019">
       <w:pPr>
         <w:ind w:right="-277"/>
         <w:jc w:val="both"/>
@@ -768,7 +776,7 @@
         <w:t xml:space="preserve">2. Срок практики: с {{practice_start}} по {{practice_end}}</w:t>
       </w:r>
     </w:p>
-    <w:p>
+    <w:p ns1:paraId="0000001A">
       <w:pPr>
         <w:ind w:right="-136"/>
         <w:rPr/>
@@ -795,7 +803,7 @@
         <w:tab/>
       </w:r>
     </w:p>
-    <w:p>
+    <w:p ns1:paraId="0000001B">
       <w:pPr>
         <w:jc w:val="both"/>
         <w:rPr>
@@ -810,7 +818,7 @@
         <w:t xml:space="preserve">4. Вид практики: Производственная практика</w:t>
       </w:r>
     </w:p>
-    <w:p>
+    <w:p ns1:paraId="0000001C">
       <w:pPr>
         <w:jc w:val="both"/>
         <w:rPr>
@@ -825,7 +833,7 @@
         <w:t xml:space="preserve">5. Тип практики: Производственная практика, технологическая</w:t>
       </w:r>
     </w:p>
-    <w:p>
+    <w:p ns1:paraId="0000001D">
       <w:pPr>
         <w:ind w:right="5"/>
         <w:jc w:val="both"/>
@@ -845,7 +853,7 @@
         <w:t xml:space="preserve">введение,   описание   работы,   результат   практики,  заключение,   список</w:t>
       </w:r>
     </w:p>
-    <w:p>
+    <w:p ns1:paraId="0000001E">
       <w:pPr>
         <w:ind w:right="-277"/>
         <w:jc w:val="both"/>
@@ -868,7 +876,7 @@
         <w:tab/>
       </w:r>
     </w:p>
-    <w:p>
+    <w:p ns1:paraId="0000001F">
       <w:pPr>
         <w:jc w:val="both"/>
         <w:rPr/>
@@ -879,7 +887,7 @@
         </w:rPr>
       </w:r>
     </w:p>
-    <w:p>
+    <w:p ns1:paraId="00000020">
       <w:pPr>
         <w:jc w:val="center"/>
         <w:rPr>
@@ -942,7 +950,7 @@
           <w:tcPr>
             <w:shd w:fill="auto" w:val="clear"/>
           </w:tcPr>
-          <w:p>
+          <w:p ns1:paraId="00000021">
             <w:pPr>
               <w:jc w:val="center"/>
               <w:rPr>
@@ -975,7 +983,7 @@
           <w:tcPr>
             <w:shd w:fill="auto" w:val="clear"/>
           </w:tcPr>
-          <w:p>
+          <w:p ns1:paraId="00000022">
             <w:pPr>
               <w:jc w:val="center"/>
               <w:rPr>
@@ -1007,7 +1015,7 @@
           <w:tcPr>
             <w:shd w:fill="auto" w:val="clear"/>
           </w:tcPr>
-          <w:p>
+          <w:p ns1:paraId="00000023">
             <w:pPr>
               <w:jc w:val="center"/>
               <w:rPr>
@@ -1039,7 +1047,7 @@
           <w:tcPr>
             <w:shd w:fill="auto" w:val="clear"/>
           </w:tcPr>
-          <w:p>
+          <w:p ns1:paraId="00000024">
             <w:pPr>
               <w:jc w:val="center"/>
               <w:rPr>
@@ -1071,7 +1079,7 @@
       <w:tr>
         <w:trPr>
           <w:cantSplit w:val="0"/>
-          <w:trHeight w:val="1802" w:hRule="atLeast"/>
+          <w:trHeight w:val="1450" w:hRule="atLeast"/>
           <w:tblHeader w:val="0"/>
         </w:trPr>
         <w:tc>
@@ -1079,7 +1087,7 @@
             <w:shd w:fill="auto" w:val="clear"/>
             <w:vAlign w:val="center"/>
           </w:tcPr>
-          <w:p>
+          <w:p ns1:paraId="00000025">
             <w:pPr>
               <w:rPr>
                 <w:sz w:val="18"/>
@@ -1102,7 +1110,7 @@
           <w:tcPr>
             <w:shd w:fill="auto" w:val="clear"/>
           </w:tcPr>
-          <w:p>
+          <w:p ns1:paraId="00000026">
             <w:pPr>
               <w:rPr>
                 <w:sz w:val="18"/>
@@ -1132,7 +1140,7 @@
             <w:shd w:fill="auto" w:val="clear"/>
             <w:vAlign w:val="center"/>
           </w:tcPr>
-          <w:p>
+          <w:p ns1:paraId="00000027">
             <w:pPr>
               <w:jc w:val="center"/>
               <w:rPr>
@@ -1151,7 +1159,7 @@
               <w:t xml:space="preserve">с {{practice_start}}</w:t>
             </w:r>
           </w:p>
-          <w:p>
+          <w:p ns1:paraId="00000028">
             <w:pPr>
               <w:jc w:val="center"/>
               <w:rPr>
@@ -1170,7 +1178,7 @@
               <w:t xml:space="preserve">(дата начала    практики)</w:t>
             </w:r>
           </w:p>
-          <w:p>
+          <w:p ns1:paraId="00000029">
             <w:pPr>
               <w:jc w:val="center"/>
               <w:rPr>
@@ -1195,7 +1203,7 @@
             <w:shd w:fill="auto" w:val="clear"/>
             <w:vAlign w:val="center"/>
           </w:tcPr>
-          <w:p>
+          <w:p ns1:paraId="0000002A">
             <w:pPr>
               <w:jc w:val="center"/>
               <w:rPr>
@@ -1225,7 +1233,7 @@
       <w:tr>
         <w:trPr>
           <w:cantSplit w:val="0"/>
-          <w:trHeight w:val="2153" w:hRule="atLeast"/>
+          <w:trHeight w:val="1700" w:hRule="atLeast"/>
           <w:tblHeader w:val="0"/>
         </w:trPr>
         <w:tc>
@@ -1233,7 +1241,7 @@
             <w:shd w:fill="auto" w:val="clear"/>
             <w:vAlign w:val="center"/>
           </w:tcPr>
-          <w:p>
+          <w:p ns1:paraId="0000002B">
             <w:pPr>
               <w:rPr>
                 <w:sz w:val="18"/>
@@ -1256,7 +1264,7 @@
           <w:tcPr>
             <w:shd w:fill="auto" w:val="clear"/>
           </w:tcPr>
-          <w:p>
+          <w:p ns1:paraId="0000002C">
             <w:pPr>
               <w:jc w:val="both"/>
               <w:rPr>
@@ -1267,8 +1275,8 @@
             </w:pPr>
             <w:r>
               <w:rPr>
-                <w:sz w:val="18"/>
-                <w:szCs w:val="18"/>
+                <w:sz w:val="16"/>
+                <w:szCs w:val="16"/>
                 <w:u w:val="none"/>
                 <w:rtl w:val="0"/>
               </w:rPr>
@@ -1281,7 +1289,7 @@
             <w:shd w:fill="auto" w:val="clear"/>
             <w:vAlign w:val="center"/>
           </w:tcPr>
-          <w:p>
+          <w:p ns1:paraId="0000002D">
             <w:pPr>
               <w:jc w:val="center"/>
               <w:rPr>
@@ -1306,7 +1314,7 @@
             <w:shd w:fill="auto" w:val="clear"/>
             <w:vAlign w:val="center"/>
           </w:tcPr>
-          <w:p>
+          <w:p ns1:paraId="0000002E">
             <w:pPr>
               <w:jc w:val="center"/>
               <w:rPr>
@@ -1336,7 +1344,7 @@
       <w:tr>
         <w:trPr>
           <w:cantSplit w:val="0"/>
-          <w:trHeight w:val="1471" w:hRule="atLeast"/>
+          <w:trHeight w:val="1150" w:hRule="atLeast"/>
           <w:tblHeader w:val="0"/>
         </w:trPr>
         <w:tc>
@@ -1344,7 +1352,7 @@
             <w:shd w:fill="auto" w:val="clear"/>
             <w:vAlign w:val="center"/>
           </w:tcPr>
-          <w:p>
+          <w:p ns1:paraId="0000002F">
             <w:pPr>
               <w:rPr>
                 <w:sz w:val="18"/>
@@ -1367,7 +1375,7 @@
           <w:tcPr>
             <w:shd w:fill="auto" w:val="clear"/>
           </w:tcPr>
-          <w:p>
+          <w:p ns1:paraId="00000030">
             <w:pPr>
               <w:rPr>
                 <w:sz w:val="18"/>
@@ -1397,7 +1405,7 @@
             <w:shd w:fill="auto" w:val="clear"/>
             <w:vAlign w:val="center"/>
           </w:tcPr>
-          <w:p>
+          <w:p ns1:paraId="00000031">
             <w:pPr>
               <w:jc w:val="center"/>
               <w:rPr>
@@ -1416,7 +1424,7 @@
               <w:t xml:space="preserve">с {{practice_start}}</w:t>
             </w:r>
           </w:p>
-          <w:p>
+          <w:p ns1:paraId="00000032">
             <w:pPr>
               <w:jc w:val="center"/>
               <w:rPr>
@@ -1435,7 +1443,7 @@
               <w:t xml:space="preserve">по {{practice_end}}</w:t>
             </w:r>
           </w:p>
-          <w:p>
+          <w:p ns1:paraId="00000033">
             <w:pPr>
               <w:jc w:val="center"/>
               <w:rPr>
@@ -1460,7 +1468,7 @@
             <w:shd w:fill="auto" w:val="clear"/>
             <w:vAlign w:val="center"/>
           </w:tcPr>
-          <w:p>
+          <w:p ns1:paraId="00000034">
             <w:pPr>
               <w:jc w:val="center"/>
               <w:rPr>
@@ -1488,7 +1496,7 @@
         </w:tc>
       </w:tr>
     </w:tbl>
-    <w:p>
+    <w:p ns1:paraId="00000035">
       <w:pPr>
         <w:pBdr>
           <w:top w:space="0" w:sz="0" w:val="nil"/>
@@ -1508,7 +1516,7 @@
         </w:rPr>
       </w:r>
     </w:p>
-    <w:p>
+    <w:p ns1:paraId="00000036">
       <w:pPr>
         <w:pBdr>
           <w:top w:space="0" w:sz="0" w:val="nil"/>
@@ -1532,7 +1540,7 @@
         <w:t xml:space="preserve">Содержание практики и планируемые результаты практики согласованы с руководителем практики от профильной организации</w:t>
       </w:r>
     </w:p>
-    <w:p>
+    <w:p ns1:paraId="00000037">
       <w:pPr>
         <w:pBdr>
           <w:top w:space="0" w:sz="0" w:val="nil"/>
@@ -1552,7 +1560,7 @@
         </w:rPr>
       </w:r>
     </w:p>
-    <w:p>
+    <w:p ns1:paraId="00000038">
       <w:pPr>
         <w:pBdr>
           <w:top w:space="0" w:sz="0" w:val="nil"/>
@@ -1583,11 +1591,13 @@
         <w:rPr>
           <w:color w:val="000000"/>
           <w:rtl w:val="0"/>
+          <w:sz w:val="18"/>
+          <w:szCs w:val="18"/>
         </w:rPr>
         <w:t xml:space="preserve">{{supervisor_urfu_name}}                    </w:t>
       </w:r>
     </w:p>
-    <w:p>
+    <w:p ns1:paraId="00000039">
       <w:pPr>
         <w:pBdr>
           <w:top w:space="0" w:sz="0" w:val="nil"/>
@@ -1626,7 +1636,7 @@
         <w:t xml:space="preserve">Подпись                                                               расшифровка подписи</w:t>
       </w:r>
     </w:p>
-    <w:p>
+    <w:p ns1:paraId="0000003A">
       <w:pPr>
         <w:pBdr>
           <w:top w:space="0" w:sz="0" w:val="nil"/>
@@ -1671,7 +1681,7 @@
         <w:t xml:space="preserve">__</w:t>
       </w:r>
     </w:p>
-    <w:p>
+    <w:p ns1:paraId="0000003B">
       <w:pPr>
         <w:pBdr>
           <w:top w:space="0" w:sz="0" w:val="nil"/>
@@ -1707,7 +1717,7 @@
         <w:t xml:space="preserve">Подпись                                                               расшифровка подписи</w:t>
       </w:r>
     </w:p>
-    <w:p>
+    <w:p ns1:paraId="0000003C">
       <w:pPr>
         <w:rPr>
           <w:color w:val="ffffff"/>
@@ -1744,7 +1754,7 @@
         </w:rPr>
       </w:r>
     </w:p>
-    <w:p>
+    <w:p ns1:paraId="0000003D">
       <w:pPr>
         <w:pBdr>
           <w:top w:space="0" w:sz="0" w:val="nil"/>

</xml_diff>